<commit_message>
Menghapus file dokumentasi sementara
</commit_message>
<xml_diff>
--- a/dokumentasi/Dokumentasi tahap 1_Anisa.docx
+++ b/dokumentasi/Dokumentasi tahap 1_Anisa.docx
@@ -289,6 +289,7 @@
       <w:r>
         <w:rPr>
           <w:rFonts w:ascii="Times New Roman" w:hAnsi="Times New Roman" w:cs="Times New Roman"/>
+          <w:noProof/>
         </w:rPr>
         <w:drawing>
           <wp:inline distT="0" distB="0" distL="0" distR="0" wp14:anchorId="6F835ADF" wp14:editId="1B5EC908">
@@ -409,6 +410,7 @@
       <w:r>
         <w:rPr>
           <w:rFonts w:ascii="Times New Roman" w:hAnsi="Times New Roman" w:cs="Times New Roman"/>
+          <w:noProof/>
         </w:rPr>
         <w:lastRenderedPageBreak/>
         <w:drawing>
@@ -482,6 +484,457 @@
           <w:rFonts w:ascii="Times New Roman" w:hAnsi="Times New Roman" w:cs="Times New Roman"/>
         </w:rPr>
         <w:t xml:space="preserve"> detail data</w:t>
+      </w:r>
+    </w:p>
+    <w:p>
+      <w:pPr>
+        <w:pStyle w:val="ListParagraph"/>
+        <w:rPr>
+          <w:rFonts w:ascii="Times New Roman" w:hAnsi="Times New Roman" w:cs="Times New Roman"/>
+        </w:rPr>
+      </w:pPr>
+    </w:p>
+    <w:p>
+      <w:pPr>
+        <w:pStyle w:val="ListParagraph"/>
+        <w:rPr>
+          <w:rFonts w:ascii="Times New Roman" w:hAnsi="Times New Roman" w:cs="Times New Roman"/>
+        </w:rPr>
+      </w:pPr>
+      <w:r>
+        <w:rPr>
+          <w:rFonts w:ascii="Times New Roman" w:hAnsi="Times New Roman" w:cs="Times New Roman"/>
+        </w:rPr>
+        <w:drawing>
+          <wp:inline distT="0" distB="0" distL="0" distR="0" wp14:anchorId="0457BD4D" wp14:editId="160FFE3B">
+            <wp:extent cx="4604251" cy="3067291"/>
+            <wp:effectExtent l="0" t="0" r="6350" b="0"/>
+            <wp:docPr id="4" name="Picture 4"/>
+            <wp:cNvGraphicFramePr>
+              <a:graphicFrameLocks xmlns:a="http://schemas.openxmlformats.org/drawingml/2006/main" noChangeAspect="1"/>
+            </wp:cNvGraphicFramePr>
+            <a:graphic xmlns:a="http://schemas.openxmlformats.org/drawingml/2006/main">
+              <a:graphicData uri="http://schemas.openxmlformats.org/drawingml/2006/picture">
+                <pic:pic xmlns:pic="http://schemas.openxmlformats.org/drawingml/2006/picture">
+                  <pic:nvPicPr>
+                    <pic:cNvPr id="1" name=""/>
+                    <pic:cNvPicPr/>
+                  </pic:nvPicPr>
+                  <pic:blipFill>
+                    <a:blip r:embed="rId8"/>
+                    <a:stretch>
+                      <a:fillRect/>
+                    </a:stretch>
+                  </pic:blipFill>
+                  <pic:spPr>
+                    <a:xfrm>
+                      <a:off x="0" y="0"/>
+                      <a:ext cx="4621698" cy="3078914"/>
+                    </a:xfrm>
+                    <a:prstGeom prst="rect">
+                      <a:avLst/>
+                    </a:prstGeom>
+                  </pic:spPr>
+                </pic:pic>
+              </a:graphicData>
+            </a:graphic>
+          </wp:inline>
+        </w:drawing>
+      </w:r>
+    </w:p>
+    <w:p>
+      <w:pPr>
+        <w:pStyle w:val="ListParagraph"/>
+        <w:rPr>
+          <w:rFonts w:ascii="Times New Roman" w:hAnsi="Times New Roman" w:cs="Times New Roman"/>
+        </w:rPr>
+      </w:pPr>
+      <w:proofErr w:type="spellStart"/>
+      <w:r>
+        <w:rPr>
+          <w:rFonts w:ascii="Times New Roman" w:hAnsi="Times New Roman" w:cs="Times New Roman"/>
+        </w:rPr>
+        <w:t>Ini</w:t>
+      </w:r>
+      <w:proofErr w:type="spellEnd"/>
+      <w:r>
+        <w:rPr>
+          <w:rFonts w:ascii="Times New Roman" w:hAnsi="Times New Roman" w:cs="Times New Roman"/>
+        </w:rPr>
+        <w:t xml:space="preserve"> </w:t>
+      </w:r>
+      <w:proofErr w:type="spellStart"/>
+      <w:r>
+        <w:rPr>
+          <w:rFonts w:ascii="Times New Roman" w:hAnsi="Times New Roman" w:cs="Times New Roman"/>
+        </w:rPr>
+        <w:t>untuk</w:t>
+      </w:r>
+      <w:proofErr w:type="spellEnd"/>
+      <w:r>
+        <w:rPr>
+          <w:rFonts w:ascii="Times New Roman" w:hAnsi="Times New Roman" w:cs="Times New Roman"/>
+        </w:rPr>
+        <w:t xml:space="preserve"> </w:t>
+      </w:r>
+      <w:proofErr w:type="spellStart"/>
+      <w:r>
+        <w:rPr>
+          <w:rFonts w:ascii="Times New Roman" w:hAnsi="Times New Roman" w:cs="Times New Roman"/>
+        </w:rPr>
+        <w:t>tambah</w:t>
+      </w:r>
+      <w:proofErr w:type="spellEnd"/>
+      <w:r>
+        <w:rPr>
+          <w:rFonts w:ascii="Times New Roman" w:hAnsi="Times New Roman" w:cs="Times New Roman"/>
+        </w:rPr>
+        <w:t xml:space="preserve"> data, </w:t>
+      </w:r>
+      <w:proofErr w:type="spellStart"/>
+      <w:r>
+        <w:rPr>
+          <w:rFonts w:ascii="Times New Roman" w:hAnsi="Times New Roman" w:cs="Times New Roman"/>
+        </w:rPr>
+        <w:t>statusnya</w:t>
+      </w:r>
+      <w:proofErr w:type="spellEnd"/>
+      <w:r>
+        <w:rPr>
+          <w:rFonts w:ascii="Times New Roman" w:hAnsi="Times New Roman" w:cs="Times New Roman"/>
+        </w:rPr>
+        <w:t xml:space="preserve"> </w:t>
+      </w:r>
+      <w:r>
+        <w:rPr>
+          <w:rFonts w:ascii="Times New Roman" w:hAnsi="Times New Roman" w:cs="Times New Roman"/>
+        </w:rPr>
+        <w:t>success</w:t>
+      </w:r>
+    </w:p>
+    <w:p>
+      <w:pPr>
+        <w:pStyle w:val="ListParagraph"/>
+        <w:rPr>
+          <w:rFonts w:ascii="Times New Roman" w:hAnsi="Times New Roman" w:cs="Times New Roman"/>
+        </w:rPr>
+      </w:pPr>
+    </w:p>
+    <w:p>
+      <w:pPr>
+        <w:pStyle w:val="ListParagraph"/>
+        <w:rPr>
+          <w:rFonts w:ascii="Times New Roman" w:hAnsi="Times New Roman" w:cs="Times New Roman"/>
+        </w:rPr>
+      </w:pPr>
+      <w:r>
+        <w:rPr>
+          <w:rFonts w:ascii="Times New Roman" w:hAnsi="Times New Roman" w:cs="Times New Roman"/>
+        </w:rPr>
+        <w:lastRenderedPageBreak/>
+        <w:drawing>
+          <wp:inline distT="0" distB="0" distL="0" distR="0" wp14:anchorId="51832CBF" wp14:editId="6FE09BA6">
+            <wp:extent cx="4548851" cy="3030382"/>
+            <wp:effectExtent l="0" t="0" r="4445" b="0"/>
+            <wp:docPr id="5" name="Picture 5"/>
+            <wp:cNvGraphicFramePr>
+              <a:graphicFrameLocks xmlns:a="http://schemas.openxmlformats.org/drawingml/2006/main" noChangeAspect="1"/>
+            </wp:cNvGraphicFramePr>
+            <a:graphic xmlns:a="http://schemas.openxmlformats.org/drawingml/2006/main">
+              <a:graphicData uri="http://schemas.openxmlformats.org/drawingml/2006/picture">
+                <pic:pic xmlns:pic="http://schemas.openxmlformats.org/drawingml/2006/picture">
+                  <pic:nvPicPr>
+                    <pic:cNvPr id="1" name=""/>
+                    <pic:cNvPicPr/>
+                  </pic:nvPicPr>
+                  <pic:blipFill>
+                    <a:blip r:embed="rId9"/>
+                    <a:stretch>
+                      <a:fillRect/>
+                    </a:stretch>
+                  </pic:blipFill>
+                  <pic:spPr>
+                    <a:xfrm>
+                      <a:off x="0" y="0"/>
+                      <a:ext cx="4568352" cy="3043374"/>
+                    </a:xfrm>
+                    <a:prstGeom prst="rect">
+                      <a:avLst/>
+                    </a:prstGeom>
+                  </pic:spPr>
+                </pic:pic>
+              </a:graphicData>
+            </a:graphic>
+          </wp:inline>
+        </w:drawing>
+      </w:r>
+    </w:p>
+    <w:p>
+      <w:pPr>
+        <w:pStyle w:val="ListParagraph"/>
+        <w:rPr>
+          <w:rFonts w:ascii="Times New Roman" w:hAnsi="Times New Roman" w:cs="Times New Roman"/>
+        </w:rPr>
+      </w:pPr>
+      <w:proofErr w:type="spellStart"/>
+      <w:r>
+        <w:rPr>
+          <w:rFonts w:ascii="Times New Roman" w:hAnsi="Times New Roman" w:cs="Times New Roman"/>
+        </w:rPr>
+        <w:t>Ini</w:t>
+      </w:r>
+      <w:proofErr w:type="spellEnd"/>
+      <w:r>
+        <w:rPr>
+          <w:rFonts w:ascii="Times New Roman" w:hAnsi="Times New Roman" w:cs="Times New Roman"/>
+        </w:rPr>
+        <w:t xml:space="preserve"> </w:t>
+      </w:r>
+      <w:proofErr w:type="spellStart"/>
+      <w:r>
+        <w:rPr>
+          <w:rFonts w:ascii="Times New Roman" w:hAnsi="Times New Roman" w:cs="Times New Roman"/>
+        </w:rPr>
+        <w:t>ubah</w:t>
+      </w:r>
+      <w:proofErr w:type="spellEnd"/>
+      <w:r>
+        <w:rPr>
+          <w:rFonts w:ascii="Times New Roman" w:hAnsi="Times New Roman" w:cs="Times New Roman"/>
+        </w:rPr>
+        <w:t xml:space="preserve"> data </w:t>
+      </w:r>
+      <w:proofErr w:type="spellStart"/>
+      <w:r>
+        <w:rPr>
+          <w:rFonts w:ascii="Times New Roman" w:hAnsi="Times New Roman" w:cs="Times New Roman"/>
+        </w:rPr>
+        <w:t>berhasil</w:t>
+      </w:r>
+      <w:proofErr w:type="spellEnd"/>
+      <w:r>
+        <w:rPr>
+          <w:rFonts w:ascii="Times New Roman" w:hAnsi="Times New Roman" w:cs="Times New Roman"/>
+        </w:rPr>
+        <w:t xml:space="preserve">, yang </w:t>
+      </w:r>
+      <w:proofErr w:type="spellStart"/>
+      <w:r>
+        <w:rPr>
+          <w:rFonts w:ascii="Times New Roman" w:hAnsi="Times New Roman" w:cs="Times New Roman"/>
+        </w:rPr>
+        <w:t>awalnya</w:t>
+      </w:r>
+      <w:proofErr w:type="spellEnd"/>
+      <w:r>
+        <w:rPr>
+          <w:rFonts w:ascii="Times New Roman" w:hAnsi="Times New Roman" w:cs="Times New Roman"/>
+        </w:rPr>
+        <w:t xml:space="preserve"> </w:t>
+      </w:r>
+      <w:proofErr w:type="spellStart"/>
+      <w:r>
+        <w:rPr>
+          <w:rFonts w:ascii="Times New Roman" w:hAnsi="Times New Roman" w:cs="Times New Roman"/>
+        </w:rPr>
+        <w:t>dari</w:t>
+      </w:r>
+      <w:proofErr w:type="spellEnd"/>
+      <w:r>
+        <w:rPr>
+          <w:rFonts w:ascii="Times New Roman" w:hAnsi="Times New Roman" w:cs="Times New Roman"/>
+        </w:rPr>
+        <w:t xml:space="preserve"> </w:t>
+      </w:r>
+      <w:proofErr w:type="spellStart"/>
+      <w:r>
+        <w:rPr>
+          <w:rFonts w:ascii="Times New Roman" w:hAnsi="Times New Roman" w:cs="Times New Roman"/>
+        </w:rPr>
+        <w:t>bukit</w:t>
+      </w:r>
+      <w:proofErr w:type="spellEnd"/>
+      <w:r>
+        <w:rPr>
+          <w:rFonts w:ascii="Times New Roman" w:hAnsi="Times New Roman" w:cs="Times New Roman"/>
+        </w:rPr>
+        <w:t xml:space="preserve"> </w:t>
+      </w:r>
+      <w:proofErr w:type="spellStart"/>
+      <w:r>
+        <w:rPr>
+          <w:rFonts w:ascii="Times New Roman" w:hAnsi="Times New Roman" w:cs="Times New Roman"/>
+        </w:rPr>
+        <w:t>sakura</w:t>
+      </w:r>
+      <w:proofErr w:type="spellEnd"/>
+      <w:r>
+        <w:rPr>
+          <w:rFonts w:ascii="Times New Roman" w:hAnsi="Times New Roman" w:cs="Times New Roman"/>
+        </w:rPr>
+        <w:t xml:space="preserve"> dan rating 4.5 </w:t>
+      </w:r>
+      <w:proofErr w:type="spellStart"/>
+      <w:r>
+        <w:rPr>
+          <w:rFonts w:ascii="Times New Roman" w:hAnsi="Times New Roman" w:cs="Times New Roman"/>
+        </w:rPr>
+        <w:t>menjadi</w:t>
+      </w:r>
+      <w:proofErr w:type="spellEnd"/>
+      <w:r>
+        <w:rPr>
+          <w:rFonts w:ascii="Times New Roman" w:hAnsi="Times New Roman" w:cs="Times New Roman"/>
+        </w:rPr>
+        <w:t xml:space="preserve"> </w:t>
+      </w:r>
+      <w:proofErr w:type="spellStart"/>
+      <w:r>
+        <w:rPr>
+          <w:rFonts w:ascii="Times New Roman" w:hAnsi="Times New Roman" w:cs="Times New Roman"/>
+        </w:rPr>
+        <w:t>bukit</w:t>
+      </w:r>
+      <w:proofErr w:type="spellEnd"/>
+      <w:r>
+        <w:rPr>
+          <w:rFonts w:ascii="Times New Roman" w:hAnsi="Times New Roman" w:cs="Times New Roman"/>
+        </w:rPr>
+        <w:t xml:space="preserve"> </w:t>
+      </w:r>
+      <w:proofErr w:type="spellStart"/>
+      <w:r>
+        <w:rPr>
+          <w:rFonts w:ascii="Times New Roman" w:hAnsi="Times New Roman" w:cs="Times New Roman"/>
+        </w:rPr>
+        <w:t>sakura</w:t>
+      </w:r>
+      <w:proofErr w:type="spellEnd"/>
+      <w:r>
+        <w:rPr>
+          <w:rFonts w:ascii="Times New Roman" w:hAnsi="Times New Roman" w:cs="Times New Roman"/>
+        </w:rPr>
+        <w:t xml:space="preserve"> </w:t>
+      </w:r>
+      <w:proofErr w:type="spellStart"/>
+      <w:r>
+        <w:rPr>
+          <w:rFonts w:ascii="Times New Roman" w:hAnsi="Times New Roman" w:cs="Times New Roman"/>
+        </w:rPr>
+        <w:t>lampung</w:t>
+      </w:r>
+      <w:proofErr w:type="spellEnd"/>
+      <w:r>
+        <w:rPr>
+          <w:rFonts w:ascii="Times New Roman" w:hAnsi="Times New Roman" w:cs="Times New Roman"/>
+        </w:rPr>
+        <w:t xml:space="preserve"> dan ranting 4.9.</w:t>
+      </w:r>
+    </w:p>
+    <w:p>
+      <w:pPr>
+        <w:pStyle w:val="ListParagraph"/>
+        <w:rPr>
+          <w:rFonts w:ascii="Times New Roman" w:hAnsi="Times New Roman" w:cs="Times New Roman"/>
+        </w:rPr>
+      </w:pPr>
+    </w:p>
+    <w:p>
+      <w:pPr>
+        <w:pStyle w:val="ListParagraph"/>
+        <w:rPr>
+          <w:rFonts w:ascii="Times New Roman" w:hAnsi="Times New Roman" w:cs="Times New Roman"/>
+        </w:rPr>
+      </w:pPr>
+      <w:r>
+        <w:rPr>
+          <w:rFonts w:ascii="Times New Roman" w:hAnsi="Times New Roman" w:cs="Times New Roman"/>
+        </w:rPr>
+        <w:drawing>
+          <wp:inline distT="0" distB="0" distL="0" distR="0" wp14:anchorId="4A5E151E" wp14:editId="72B2A35B">
+            <wp:extent cx="4549454" cy="3030785"/>
+            <wp:effectExtent l="0" t="0" r="3810" b="0"/>
+            <wp:docPr id="7" name="Picture 7"/>
+            <wp:cNvGraphicFramePr>
+              <a:graphicFrameLocks xmlns:a="http://schemas.openxmlformats.org/drawingml/2006/main" noChangeAspect="1"/>
+            </wp:cNvGraphicFramePr>
+            <a:graphic xmlns:a="http://schemas.openxmlformats.org/drawingml/2006/main">
+              <a:graphicData uri="http://schemas.openxmlformats.org/drawingml/2006/picture">
+                <pic:pic xmlns:pic="http://schemas.openxmlformats.org/drawingml/2006/picture">
+                  <pic:nvPicPr>
+                    <pic:cNvPr id="1" name=""/>
+                    <pic:cNvPicPr/>
+                  </pic:nvPicPr>
+                  <pic:blipFill>
+                    <a:blip r:embed="rId10"/>
+                    <a:stretch>
+                      <a:fillRect/>
+                    </a:stretch>
+                  </pic:blipFill>
+                  <pic:spPr>
+                    <a:xfrm>
+                      <a:off x="0" y="0"/>
+                      <a:ext cx="4567391" cy="3042734"/>
+                    </a:xfrm>
+                    <a:prstGeom prst="rect">
+                      <a:avLst/>
+                    </a:prstGeom>
+                  </pic:spPr>
+                </pic:pic>
+              </a:graphicData>
+            </a:graphic>
+          </wp:inline>
+        </w:drawing>
+      </w:r>
+    </w:p>
+    <w:p>
+      <w:pPr>
+        <w:pStyle w:val="ListParagraph"/>
+        <w:rPr>
+          <w:rFonts w:ascii="Times New Roman" w:hAnsi="Times New Roman" w:cs="Times New Roman"/>
+        </w:rPr>
+      </w:pPr>
+      <w:proofErr w:type="spellStart"/>
+      <w:r>
+        <w:rPr>
+          <w:rFonts w:ascii="Times New Roman" w:hAnsi="Times New Roman" w:cs="Times New Roman"/>
+        </w:rPr>
+        <w:t>Fungsi</w:t>
+      </w:r>
+      <w:proofErr w:type="spellEnd"/>
+      <w:r>
+        <w:rPr>
+          <w:rFonts w:ascii="Times New Roman" w:hAnsi="Times New Roman" w:cs="Times New Roman"/>
+        </w:rPr>
+        <w:t xml:space="preserve"> </w:t>
+      </w:r>
+      <w:proofErr w:type="spellStart"/>
+      <w:r>
+        <w:rPr>
+          <w:rFonts w:ascii="Times New Roman" w:hAnsi="Times New Roman" w:cs="Times New Roman"/>
+        </w:rPr>
+        <w:t>hapus</w:t>
+      </w:r>
+      <w:proofErr w:type="spellEnd"/>
+      <w:r>
+        <w:rPr>
+          <w:rFonts w:ascii="Times New Roman" w:hAnsi="Times New Roman" w:cs="Times New Roman"/>
+        </w:rPr>
+        <w:t xml:space="preserve"> </w:t>
+      </w:r>
+      <w:proofErr w:type="spellStart"/>
+      <w:r>
+        <w:rPr>
+          <w:rFonts w:ascii="Times New Roman" w:hAnsi="Times New Roman" w:cs="Times New Roman"/>
+        </w:rPr>
+        <w:t>sudah</w:t>
+      </w:r>
+      <w:proofErr w:type="spellEnd"/>
+      <w:r>
+        <w:rPr>
+          <w:rFonts w:ascii="Times New Roman" w:hAnsi="Times New Roman" w:cs="Times New Roman"/>
+        </w:rPr>
+        <w:t xml:space="preserve"> berjalan</w:t>
       </w:r>
       <w:bookmarkStart w:id="0" w:name="_GoBack"/>
       <w:bookmarkEnd w:id="0"/>

</xml_diff>